<commit_message>
Real distributed FL on Raspberry Pi (Flower/gRPC): live-FL layer, Pi setup guide, straggler results; report section 3.6
</commit_message>
<xml_diff>
--- a/reports/technical_report.docx
+++ b/reports/technical_report.docx
@@ -147,7 +147,7 @@
           <w:sz w:val="21"/>
           <w:szCs w:val="21"/>
         </w:rPr>
-        <w:t xml:space="preserve">. We quantify the trade-offs between model performance, data heterogeneity and privacy. Three aggregation strategies (FedAvg, FedProx, SCAFFOLD) are compared under an identical protocol; local Differential Privacy (DP-SGD) is added with an independently-verified (ε, δ) accountant and a privacy–utility curve; a membership-inference attack demonstrates the privacy protection empirically; and an additive-mask secure-aggregation scheme is simulated and proven correct. The main findings: federation substantially outperforms isolated local training and recovers a large share of the centralized-training accuracy without any data sharing (FedAvg 0.32 balanced accuracy vs 0.46 centralized and 0.21 local-only); the drift-control methods FedProx and SCAFFOLD cut client drift by 5–9× exactly as theory predicts, yet on this benchmark they do not improve balanced accuracy over plain FedAvg — a concrete, reproducible negative result; and differential privacy trades accuracy for privacy along a clean monotonic curve while measurably reducing membership-inference leakage.</w:t>
+        <w:t xml:space="preserve">. We quantify the trade-offs between model performance, data heterogeneity and privacy. Three aggregation strategies (FedAvg, FedProx, SCAFFOLD) are compared under an identical protocol; local Differential Privacy (DP-SGD) is added with an independently-verified (ε, δ) accountant and a privacy–utility curve; a membership-inference attack demonstrates the privacy protection empirically; and an additive-mask secure-aggregation scheme is simulated and proven correct. The main findings: federation substantially outperforms isolated local training and recovers a large share of the centralized-training accuracy without any data sharing (FedAvg 0.32 balanced accuracy vs 0.46 centralized and 0.21 local-only); the drift-control methods FedProx and SCAFFOLD cut client drift by 5–9× exactly as theory predicts, yet on this benchmark they do not improve balanced accuracy over plain FedAvg — a concrete, reproducible negative result; and differential privacy trades accuracy for privacy along a clean monotonic curve while measurably reducing membership-inference leakage. Beyond the simulation, we also demonstrate the system running genuinely distributed on a laptop plus a Raspberry Pi 5 edge device, quantifying the cross-device straggler effect.</w:t>
       </w:r>
     </w:p>
     <w:p>
@@ -3427,6 +3427,297 @@
     </w:p>
     <w:p>
       <w:pPr>
+        <w:pStyle w:val="Heading2"/>
+        <w:spacing w:after="80" w:before="180"/>
+      </w:pPr>
+      <w:r>
+        <w:rPr>
+          <w:b/>
+          <w:bCs/>
+        </w:rPr>
+        <w:t xml:space="preserve">3.6  Real distributed FL on edge hardware — Raspberry Pi (bonus)</w:t>
+      </w:r>
+    </w:p>
+    <w:p>
+      <w:pPr>
+        <w:spacing w:after="120" w:line="276"/>
+        <w:jc w:val="both"/>
+      </w:pPr>
+      <w:r>
+        <w:rPr>
+          <w:sz w:val="21"/>
+          <w:szCs w:val="21"/>
+        </w:rPr>
+        <w:t xml:space="preserve">The results above come from an in-process </w:t>
+      </w:r>
+      <w:r>
+        <w:rPr>
+          <w:i/>
+          <w:iCs/>
+          <w:sz w:val="21"/>
+          <w:szCs w:val="21"/>
+        </w:rPr>
+        <w:t xml:space="preserve">simulation</w:t>
+      </w:r>
+      <w:r>
+        <w:rPr>
+          <w:sz w:val="21"/>
+          <w:szCs w:val="21"/>
+        </w:rPr>
+        <w:t xml:space="preserve"> (clients trained sequentially on one GPU). To prove the system is </w:t>
+      </w:r>
+      <w:r>
+        <w:rPr>
+          <w:b/>
+          <w:bCs/>
+          <w:sz w:val="21"/>
+          <w:szCs w:val="21"/>
+        </w:rPr>
+        <w:t xml:space="preserve">genuinely distributed</w:t>
+      </w:r>
+      <w:r>
+        <w:rPr>
+          <w:sz w:val="21"/>
+          <w:szCs w:val="21"/>
+        </w:rPr>
+        <w:t xml:space="preserve">, we deployed it across two physical machines using the </w:t>
+      </w:r>
+      <w:r>
+        <w:rPr>
+          <w:b/>
+          <w:bCs/>
+          <w:sz w:val="21"/>
+          <w:szCs w:val="21"/>
+        </w:rPr>
+        <w:t xml:space="preserve">Flower</w:t>
+      </w:r>
+      <w:r>
+        <w:rPr>
+          <w:sz w:val="21"/>
+          <w:szCs w:val="21"/>
+        </w:rPr>
+        <w:t xml:space="preserve"> framework over gRPC: a laptop runs the coordinating server plus one client on its GPU, while a </w:t>
+      </w:r>
+      <w:r>
+        <w:rPr>
+          <w:b/>
+          <w:bCs/>
+          <w:sz w:val="21"/>
+          <w:szCs w:val="21"/>
+        </w:rPr>
+        <w:t xml:space="preserve">Raspberry Pi 5</w:t>
+      </w:r>
+      <w:r>
+        <w:rPr>
+          <w:sz w:val="21"/>
+          <w:szCs w:val="21"/>
+        </w:rPr>
+        <w:t xml:space="preserve"> acts as a real edge hospital — training on its own local silo (the smallest client, 281 images) and exchanging </w:t>
+      </w:r>
+      <w:r>
+        <w:rPr>
+          <w:b/>
+          <w:bCs/>
+          <w:sz w:val="21"/>
+          <w:szCs w:val="21"/>
+        </w:rPr>
+        <w:t xml:space="preserve">only model weights</w:t>
+      </w:r>
+      <w:r>
+        <w:rPr>
+          <w:sz w:val="21"/>
+          <w:szCs w:val="21"/>
+        </w:rPr>
+        <w:t xml:space="preserve"> over the network; raw images never leave the Pi. The Pi runs the exact same engine (model, loop, metrics) as the simulation, warm-started from the pre-trained global model so a short live run shows real accuracy.</w:t>
+      </w:r>
+    </w:p>
+    <w:p>
+      <w:pPr>
+        <w:spacing w:after="60" w:before="120"/>
+        <w:jc w:val="center"/>
+      </w:pPr>
+      <w:r>
+        <w:drawing>
+          <wp:inline distT="0" distB="0" distL="0" distR="0">
+            <wp:extent cx="3810000" cy="2514600"/>
+            <wp:effectExtent t="0" r="0" b="0" l="0"/>
+            <wp:docPr id="1" name="" descr="" title=""/>
+            <wp:cNvGraphicFramePr>
+              <a:graphicFrameLocks xmlns:a="http://schemas.openxmlformats.org/drawingml/2006/main" noChangeAspect="1"/>
+            </wp:cNvGraphicFramePr>
+            <a:graphic xmlns:a="http://schemas.openxmlformats.org/drawingml/2006/main">
+              <a:graphicData uri="http://schemas.openxmlformats.org/drawingml/2006/picture">
+                <pic:pic xmlns:pic="http://schemas.openxmlformats.org/drawingml/2006/picture">
+                  <pic:nvPicPr>
+                    <pic:cNvPr id="0" name="" descr=""/>
+                    <pic:cNvPicPr>
+                      <a:picLocks noChangeAspect="1" noChangeArrowheads="1"/>
+                    </pic:cNvPicPr>
+                  </pic:nvPicPr>
+                  <pic:blipFill>
+                    <a:blip r:embed="rId14" cstate="none"/>
+                    <a:srcRect/>
+                    <a:stretch>
+                      <a:fillRect/>
+                    </a:stretch>
+                  </pic:blipFill>
+                  <pic:spPr bwMode="auto">
+                    <a:xfrm>
+                      <a:off x="0" y="0"/>
+                      <a:ext cx="3810000" cy="2514600"/>
+                    </a:xfrm>
+                    <a:prstGeom prst="rect">
+                      <a:avLst/>
+                    </a:prstGeom>
+                  </pic:spPr>
+                </pic:pic>
+              </a:graphicData>
+            </a:graphic>
+          </wp:inline>
+        </w:drawing>
+      </w:r>
+    </w:p>
+    <w:p>
+      <w:pPr>
+        <w:spacing w:after="180"/>
+        <w:jc w:val="center"/>
+      </w:pPr>
+      <w:r>
+        <w:rPr>
+          <w:i/>
+          <w:iCs/>
+          <w:color w:val="555555"/>
+          <w:sz w:val="18"/>
+          <w:szCs w:val="18"/>
+        </w:rPr>
+        <w:t xml:space="preserve">Fig. 7 — Real distributed FedAvg over the network (laptop server + GPU client + Raspberry Pi client): the global model sustains balanced accuracy ≈ 0.20, well above the majority floor.</w:t>
+      </w:r>
+    </w:p>
+    <w:p>
+      <w:pPr>
+        <w:spacing w:after="60" w:before="120"/>
+        <w:jc w:val="center"/>
+      </w:pPr>
+      <w:r>
+        <w:drawing>
+          <wp:inline distT="0" distB="0" distL="0" distR="0">
+            <wp:extent cx="3810000" cy="2514600"/>
+            <wp:effectExtent t="0" r="0" b="0" l="0"/>
+            <wp:docPr id="1" name="" descr="" title=""/>
+            <wp:cNvGraphicFramePr>
+              <a:graphicFrameLocks xmlns:a="http://schemas.openxmlformats.org/drawingml/2006/main" noChangeAspect="1"/>
+            </wp:cNvGraphicFramePr>
+            <a:graphic xmlns:a="http://schemas.openxmlformats.org/drawingml/2006/main">
+              <a:graphicData uri="http://schemas.openxmlformats.org/drawingml/2006/picture">
+                <pic:pic xmlns:pic="http://schemas.openxmlformats.org/drawingml/2006/picture">
+                  <pic:nvPicPr>
+                    <pic:cNvPr id="0" name="" descr=""/>
+                    <pic:cNvPicPr>
+                      <a:picLocks noChangeAspect="1" noChangeArrowheads="1"/>
+                    </pic:cNvPicPr>
+                  </pic:nvPicPr>
+                  <pic:blipFill>
+                    <a:blip r:embed="rId15" cstate="none"/>
+                    <a:srcRect/>
+                    <a:stretch>
+                      <a:fillRect/>
+                    </a:stretch>
+                  </pic:blipFill>
+                  <pic:spPr bwMode="auto">
+                    <a:xfrm>
+                      <a:off x="0" y="0"/>
+                      <a:ext cx="3810000" cy="2514600"/>
+                    </a:xfrm>
+                    <a:prstGeom prst="rect">
+                      <a:avLst/>
+                    </a:prstGeom>
+                  </pic:spPr>
+                </pic:pic>
+              </a:graphicData>
+            </a:graphic>
+          </wp:inline>
+        </w:drawing>
+      </w:r>
+    </w:p>
+    <w:p>
+      <w:pPr>
+        <w:spacing w:after="180"/>
+        <w:jc w:val="center"/>
+      </w:pPr>
+      <w:r>
+        <w:rPr>
+          <w:i/>
+          <w:iCs/>
+          <w:color w:val="555555"/>
+          <w:sz w:val="18"/>
+          <w:szCs w:val="18"/>
+        </w:rPr>
+        <w:t xml:space="preserve">Fig. 8 — The straggler effect: the Pi's CPU needs ≈ 8.2 s per round vs the laptop GPU's ≈ 0.5 s (≈ 17×). Synchronous FedAvg gates each round on the slowest device.</w:t>
+      </w:r>
+    </w:p>
+    <w:p>
+      <w:pPr>
+        <w:spacing w:after="120" w:line="276"/>
+        <w:jc w:val="both"/>
+      </w:pPr>
+      <w:r>
+        <w:rPr>
+          <w:sz w:val="21"/>
+          <w:szCs w:val="21"/>
+        </w:rPr>
+        <w:t xml:space="preserve">Two findings the simulation cannot show. </w:t>
+      </w:r>
+      <w:r>
+        <w:rPr>
+          <w:b/>
+          <w:bCs/>
+          <w:sz w:val="21"/>
+          <w:szCs w:val="21"/>
+        </w:rPr>
+        <w:t xml:space="preserve">(i) Edge feasibility:</w:t>
+      </w:r>
+      <w:r>
+        <w:rPr>
+          <w:sz w:val="21"/>
+          <w:szCs w:val="21"/>
+        </w:rPr>
+        <w:t xml:space="preserve"> a sub-€100 device meaningfully participates in training a clinical model without its data ever leaving it — the core FL value proposition, on real hardware. </w:t>
+      </w:r>
+      <w:r>
+        <w:rPr>
+          <w:b/>
+          <w:bCs/>
+          <w:sz w:val="21"/>
+          <w:szCs w:val="21"/>
+        </w:rPr>
+        <w:t xml:space="preserve">(ii) The straggler problem:</w:t>
+      </w:r>
+      <w:r>
+        <w:rPr>
+          <w:sz w:val="21"/>
+          <w:szCs w:val="21"/>
+        </w:rPr>
+        <w:t xml:space="preserve"> the Pi is ≈ 17× slower per round than the laptop GPU, and because FedAvg is synchronous the entire round waits for it (the 8-round run took ≈ 6.8 min, dominated by the Pi). In a real cross-device deployment this is the concrete argument for </w:t>
+      </w:r>
+      <w:r>
+        <w:rPr>
+          <w:b/>
+          <w:bCs/>
+          <w:sz w:val="21"/>
+          <w:szCs w:val="21"/>
+        </w:rPr>
+        <w:t xml:space="preserve">client sampling, asynchronous aggregation, or on-device model compression</w:t>
+      </w:r>
+      <w:r>
+        <w:rPr>
+          <w:sz w:val="21"/>
+          <w:szCs w:val="21"/>
+        </w:rPr>
+        <w:t xml:space="preserve">.</w:t>
+      </w:r>
+    </w:p>
+    <w:p>
+      <w:pPr>
         <w:pStyle w:val="Heading1"/>
         <w:spacing w:after="120" w:before="260"/>
       </w:pPr>
@@ -3785,7 +4076,7 @@
           <w:sz w:val="21"/>
           <w:szCs w:val="21"/>
         </w:rPr>
-        <w:t xml:space="preserve">We built and validated a complete cross-silo FL system for skin-lesion classification and answered all eight research sub-questions with reproducible evidence. Federation substantially outperforms isolated local training and recovers much of the gap to centralized accuracy without sharing raw images; FedProx and SCAFFOLD reduce client drift as theory predicts but, on this benchmark, do not improve balanced accuracy over plain FedAvg — a concrete, honestly-reported finding; differential privacy imposes a measured, monotonic accuracy cost while demonstrably reducing membership-inference leakage; and secure aggregation provably hides individual updates while recovering the exact aggregate. The pipeline is fully reproducible from configuration, with every reported number traceable to a generated artefact.</w:t>
+        <w:t xml:space="preserve">We built and validated a complete cross-silo FL system for skin-lesion classification and answered all eight research sub-questions with reproducible evidence. Federation substantially outperforms isolated local training and recovers much of the gap to centralized accuracy without sharing raw images; FedProx and SCAFFOLD reduce client drift as theory predicts but, on this benchmark, do not improve balanced accuracy over plain FedAvg — a concrete, honestly-reported finding; differential privacy imposes a measured, monotonic accuracy cost while demonstrably reducing membership-inference leakage; and secure aggregation provably hides individual updates while recovering the exact aggregate. The pipeline is fully reproducible from configuration, with every reported number traceable to a generated artefact. Beyond the simulation, the system was demonstrated running genuinely distributed across a laptop and a Raspberry Pi 5 edge hospital (Flower/gRPC) — raw data never leaving the device — with the cross-device straggler effect (the Pi ≈ 17× slower per round) measured directly.</w:t>
       </w:r>
     </w:p>
     <w:p>

</xml_diff>

<commit_message>
Bonus extensions: Byzantine robustness, FedAdam, Grad-CAM, 50x comms compression, dashboard; report 3.7-3.8 (11 pages)
</commit_message>
<xml_diff>
--- a/reports/technical_report.docx
+++ b/reports/technical_report.docx
@@ -2626,7 +2626,7 @@
           <w:sz w:val="21"/>
           <w:szCs w:val="21"/>
         </w:rPr>
-        <w:t xml:space="preserve">: despite cutting drift 5–9×, FedProx (0.224) and SCAFFOLD (0.217) land only marginally above local-only and well below FedAvg. FedAvg beats FedProx by 0.096 balanced accuracy, a large and consistent per-seed gap (n = 3, too few for a significant Wilcoxon). The reading is that FedProx's proximal term and SCAFFOLD's control variates keep each client tied to the global model, suppressing the local adaptation that plain FedAvg exploits on this moderately heterogeneous data; SCAFFOLD's plain-SGD inner loop also converges more slowly. This is an honest negative result for the drift-control methods on Fed-ISIC2019: they deliver stability, not accuracy.</w:t>
+        <w:t xml:space="preserve">: despite cutting drift 5–9×, FedProx (0.224) and SCAFFOLD (0.217) land only marginally above local-only and well below FedAvg. FedAvg beats FedProx by 0.096 balanced accuracy, a large and consistent per-seed gap (n = 3, too few for a significant Wilcoxon). The reading is that FedProx's proximal term and SCAFFOLD's control variates keep each client tied to the global model, suppressing the local adaptation that plain FedAvg exploits on this moderately heterogeneous data; SCAFFOLD's plain-SGD inner loop also converges more slowly. This is an honest negative result for the drift-control methods on Fed-ISIC2019: they deliver stability, not accuracy. We additionally implemented FedAdam (an adaptive-server FedOpt method reported strong on Fed-ISIC2019); on this compute-constrained setup it was highly tuning-sensitive and did not surpass well-tuned FedAvg, reinforcing the same conclusion.</w:t>
       </w:r>
     </w:p>
     <w:p>
@@ -3718,6 +3718,1166 @@
     </w:p>
     <w:p>
       <w:pPr>
+        <w:pStyle w:val="Heading2"/>
+        <w:spacing w:after="80" w:before="180"/>
+      </w:pPr>
+      <w:r>
+        <w:rPr>
+          <w:b/>
+          <w:bCs/>
+        </w:rPr>
+        <w:t xml:space="preserve">3.7  Byzantine robustness: model poisoning vs robust aggregation (bonus)</w:t>
+      </w:r>
+    </w:p>
+    <w:p>
+      <w:pPr>
+        <w:spacing w:after="120" w:line="276"/>
+        <w:jc w:val="both"/>
+      </w:pPr>
+      <w:r>
+        <w:rPr>
+          <w:sz w:val="21"/>
+          <w:szCs w:val="21"/>
+        </w:rPr>
+        <w:t xml:space="preserve">The privacy work above protects </w:t>
+      </w:r>
+      <w:r>
+        <w:rPr>
+          <w:i/>
+          <w:iCs/>
+          <w:sz w:val="21"/>
+          <w:szCs w:val="21"/>
+        </w:rPr>
+        <w:t xml:space="preserve">confidentiality</w:t>
+      </w:r>
+      <w:r>
+        <w:rPr>
+          <w:sz w:val="21"/>
+          <w:szCs w:val="21"/>
+        </w:rPr>
+        <w:t xml:space="preserve">; a complementary threat is </w:t>
+      </w:r>
+      <w:r>
+        <w:rPr>
+          <w:i/>
+          <w:iCs/>
+          <w:sz w:val="21"/>
+          <w:szCs w:val="21"/>
+        </w:rPr>
+        <w:t xml:space="preserve">integrity</w:t>
+      </w:r>
+      <w:r>
+        <w:rPr>
+          <w:sz w:val="21"/>
+          <w:szCs w:val="21"/>
+        </w:rPr>
+        <w:t xml:space="preserve"> — a malicious or compromised hospital sending poisoned updates to corrupt the shared model. Plain FedAvg is a mean, whose breakdown point is zero: a single crafted update can move it arbitrarily. We simulate 2 of 6 clients running a sign-flip model-poisoning attack (amplifying their update in the wrong direction) and compare aggregators.</w:t>
+      </w:r>
+    </w:p>
+    <w:tbl>
+      <w:tblPr>
+        <w:tblW w:type="dxa" w:w="7600"/>
+        <w:tblBorders>
+          <w:top w:val="single" w:color="BBBBBB" w:sz="2"/>
+          <w:left w:val="single" w:color="BBBBBB" w:sz="2"/>
+          <w:bottom w:val="single" w:color="BBBBBB" w:sz="2"/>
+          <w:right w:val="single" w:color="BBBBBB" w:sz="2"/>
+          <w:insideH w:val="single" w:color="DDDDDD" w:sz="1"/>
+          <w:insideV w:val="single" w:color="DDDDDD" w:sz="1"/>
+        </w:tblBorders>
+      </w:tblPr>
+      <w:tblGrid>
+        <w:gridCol w:w="3000"/>
+        <w:gridCol w:w="2200"/>
+        <w:gridCol w:w="2400"/>
+      </w:tblGrid>
+      <w:tr>
+        <w:trPr>
+          <w:tblHeader/>
+        </w:trPr>
+        <w:tc>
+          <w:tcPr>
+            <w:tcW w:type="dxa" w:w="3000"/>
+            <w:shd w:fill="1F6FB2" w:val="clear"/>
+            <w:tcMar>
+              <w:top w:type="dxa" w:w="40"/>
+              <w:left w:type="dxa" w:w="80"/>
+              <w:bottom w:type="dxa" w:w="40"/>
+              <w:right w:type="dxa" w:w="80"/>
+            </w:tcMar>
+          </w:tcPr>
+          <w:p>
+            <w:r>
+              <w:rPr>
+                <w:b/>
+                <w:bCs/>
+                <w:color w:val="FFFFFF"/>
+                <w:sz w:val="19"/>
+                <w:szCs w:val="19"/>
+              </w:rPr>
+              <w:t xml:space="preserve">Aggregator (under attack)</w:t>
+            </w:r>
+          </w:p>
+        </w:tc>
+        <w:tc>
+          <w:tcPr>
+            <w:tcW w:type="dxa" w:w="2200"/>
+            <w:shd w:fill="1F6FB2" w:val="clear"/>
+            <w:tcMar>
+              <w:top w:type="dxa" w:w="40"/>
+              <w:left w:type="dxa" w:w="80"/>
+              <w:bottom w:type="dxa" w:w="40"/>
+              <w:right w:type="dxa" w:w="80"/>
+            </w:tcMar>
+          </w:tcPr>
+          <w:p>
+            <w:r>
+              <w:rPr>
+                <w:b/>
+                <w:bCs/>
+                <w:color w:val="FFFFFF"/>
+                <w:sz w:val="19"/>
+                <w:szCs w:val="19"/>
+              </w:rPr>
+              <w:t xml:space="preserve">Balanced accuracy</w:t>
+            </w:r>
+          </w:p>
+        </w:tc>
+        <w:tc>
+          <w:tcPr>
+            <w:tcW w:type="dxa" w:w="2400"/>
+            <w:shd w:fill="1F6FB2" w:val="clear"/>
+            <w:tcMar>
+              <w:top w:type="dxa" w:w="40"/>
+              <w:left w:type="dxa" w:w="80"/>
+              <w:bottom w:type="dxa" w:w="40"/>
+              <w:right w:type="dxa" w:w="80"/>
+            </w:tcMar>
+          </w:tcPr>
+          <w:p>
+            <w:r>
+              <w:rPr>
+                <w:b/>
+                <w:bCs/>
+                <w:color w:val="FFFFFF"/>
+                <w:sz w:val="19"/>
+                <w:szCs w:val="19"/>
+              </w:rPr>
+              <w:t xml:space="preserve">Outcome</w:t>
+            </w:r>
+          </w:p>
+        </w:tc>
+      </w:tr>
+      <w:tr>
+        <w:tc>
+          <w:tcPr>
+            <w:tcW w:type="dxa" w:w="3000"/>
+            <w:tcMar>
+              <w:top w:type="dxa" w:w="40"/>
+              <w:left w:type="dxa" w:w="80"/>
+              <w:bottom w:type="dxa" w:w="40"/>
+              <w:right w:type="dxa" w:w="80"/>
+            </w:tcMar>
+          </w:tcPr>
+          <w:p>
+            <w:r>
+              <w:rPr>
+                <w:b w:val="false"/>
+                <w:bCs w:val="false"/>
+                <w:color w:val="000000"/>
+                <w:sz w:val="19"/>
+                <w:szCs w:val="19"/>
+              </w:rPr>
+              <w:t xml:space="preserve">Clean FedAvg (no attack, ref.)</w:t>
+            </w:r>
+          </w:p>
+        </w:tc>
+        <w:tc>
+          <w:tcPr>
+            <w:tcW w:type="dxa" w:w="2200"/>
+            <w:tcMar>
+              <w:top w:type="dxa" w:w="40"/>
+              <w:left w:type="dxa" w:w="80"/>
+              <w:bottom w:type="dxa" w:w="40"/>
+              <w:right w:type="dxa" w:w="80"/>
+            </w:tcMar>
+          </w:tcPr>
+          <w:p>
+            <w:r>
+              <w:rPr>
+                <w:b w:val="false"/>
+                <w:bCs w:val="false"/>
+                <w:color w:val="000000"/>
+                <w:sz w:val="19"/>
+                <w:szCs w:val="19"/>
+              </w:rPr>
+              <w:t xml:space="preserve">0.173</w:t>
+            </w:r>
+          </w:p>
+        </w:tc>
+        <w:tc>
+          <w:tcPr>
+            <w:tcW w:type="dxa" w:w="2400"/>
+            <w:tcMar>
+              <w:top w:type="dxa" w:w="40"/>
+              <w:left w:type="dxa" w:w="80"/>
+              <w:bottom w:type="dxa" w:w="40"/>
+              <w:right w:type="dxa" w:w="80"/>
+            </w:tcMar>
+          </w:tcPr>
+          <w:p>
+            <w:r>
+              <w:rPr>
+                <w:b w:val="false"/>
+                <w:bCs w:val="false"/>
+                <w:color w:val="000000"/>
+                <w:sz w:val="19"/>
+                <w:szCs w:val="19"/>
+              </w:rPr>
+              <w:t xml:space="preserve">baseline</w:t>
+            </w:r>
+          </w:p>
+        </w:tc>
+      </w:tr>
+      <w:tr>
+        <w:tc>
+          <w:tcPr>
+            <w:tcW w:type="dxa" w:w="3000"/>
+            <w:tcMar>
+              <w:top w:type="dxa" w:w="40"/>
+              <w:left w:type="dxa" w:w="80"/>
+              <w:bottom w:type="dxa" w:w="40"/>
+              <w:right w:type="dxa" w:w="80"/>
+            </w:tcMar>
+          </w:tcPr>
+          <w:p>
+            <w:r>
+              <w:rPr>
+                <w:b w:val="false"/>
+                <w:bCs w:val="false"/>
+                <w:color w:val="000000"/>
+                <w:sz w:val="19"/>
+                <w:szCs w:val="19"/>
+              </w:rPr>
+              <w:t xml:space="preserve">FedAvg — under attack</w:t>
+            </w:r>
+          </w:p>
+        </w:tc>
+        <w:tc>
+          <w:tcPr>
+            <w:tcW w:type="dxa" w:w="2200"/>
+            <w:tcMar>
+              <w:top w:type="dxa" w:w="40"/>
+              <w:left w:type="dxa" w:w="80"/>
+              <w:bottom w:type="dxa" w:w="40"/>
+              <w:right w:type="dxa" w:w="80"/>
+            </w:tcMar>
+          </w:tcPr>
+          <w:p>
+            <w:r>
+              <w:rPr>
+                <w:b w:val="false"/>
+                <w:bCs w:val="false"/>
+                <w:color w:val="000000"/>
+                <w:sz w:val="19"/>
+                <w:szCs w:val="19"/>
+              </w:rPr>
+              <w:t xml:space="preserve">0.125</w:t>
+            </w:r>
+          </w:p>
+        </w:tc>
+        <w:tc>
+          <w:tcPr>
+            <w:tcW w:type="dxa" w:w="2400"/>
+            <w:tcMar>
+              <w:top w:type="dxa" w:w="40"/>
+              <w:left w:type="dxa" w:w="80"/>
+              <w:bottom w:type="dxa" w:w="40"/>
+              <w:right w:type="dxa" w:w="80"/>
+            </w:tcMar>
+          </w:tcPr>
+          <w:p>
+            <w:r>
+              <w:rPr>
+                <w:b w:val="false"/>
+                <w:bCs w:val="false"/>
+                <w:color w:val="000000"/>
+                <w:sz w:val="19"/>
+                <w:szCs w:val="19"/>
+              </w:rPr>
+              <w:t xml:space="preserve">collapses to majority floor</w:t>
+            </w:r>
+          </w:p>
+        </w:tc>
+      </w:tr>
+      <w:tr>
+        <w:tc>
+          <w:tcPr>
+            <w:tcW w:type="dxa" w:w="3000"/>
+            <w:tcMar>
+              <w:top w:type="dxa" w:w="40"/>
+              <w:left w:type="dxa" w:w="80"/>
+              <w:bottom w:type="dxa" w:w="40"/>
+              <w:right w:type="dxa" w:w="80"/>
+            </w:tcMar>
+          </w:tcPr>
+          <w:p>
+            <w:r>
+              <w:rPr>
+                <w:b w:val="false"/>
+                <w:bCs w:val="false"/>
+                <w:color w:val="000000"/>
+                <w:sz w:val="19"/>
+                <w:szCs w:val="19"/>
+              </w:rPr>
+              <w:t xml:space="preserve">Coordinate-median (robust)</w:t>
+            </w:r>
+          </w:p>
+        </w:tc>
+        <w:tc>
+          <w:tcPr>
+            <w:tcW w:type="dxa" w:w="2200"/>
+            <w:tcMar>
+              <w:top w:type="dxa" w:w="40"/>
+              <w:left w:type="dxa" w:w="80"/>
+              <w:bottom w:type="dxa" w:w="40"/>
+              <w:right w:type="dxa" w:w="80"/>
+            </w:tcMar>
+          </w:tcPr>
+          <w:p>
+            <w:r>
+              <w:rPr>
+                <w:b w:val="false"/>
+                <w:bCs w:val="false"/>
+                <w:color w:val="000000"/>
+                <w:sz w:val="19"/>
+                <w:szCs w:val="19"/>
+              </w:rPr>
+              <w:t xml:space="preserve">0.191</w:t>
+            </w:r>
+          </w:p>
+        </w:tc>
+        <w:tc>
+          <w:tcPr>
+            <w:tcW w:type="dxa" w:w="2400"/>
+            <w:tcMar>
+              <w:top w:type="dxa" w:w="40"/>
+              <w:left w:type="dxa" w:w="80"/>
+              <w:bottom w:type="dxa" w:w="40"/>
+              <w:right w:type="dxa" w:w="80"/>
+            </w:tcMar>
+          </w:tcPr>
+          <w:p>
+            <w:r>
+              <w:rPr>
+                <w:b w:val="false"/>
+                <w:bCs w:val="false"/>
+                <w:color w:val="000000"/>
+                <w:sz w:val="19"/>
+                <w:szCs w:val="19"/>
+              </w:rPr>
+              <w:t xml:space="preserve">defended</w:t>
+            </w:r>
+          </w:p>
+        </w:tc>
+      </w:tr>
+      <w:tr>
+        <w:tc>
+          <w:tcPr>
+            <w:tcW w:type="dxa" w:w="3000"/>
+            <w:tcMar>
+              <w:top w:type="dxa" w:w="40"/>
+              <w:left w:type="dxa" w:w="80"/>
+              <w:bottom w:type="dxa" w:w="40"/>
+              <w:right w:type="dxa" w:w="80"/>
+            </w:tcMar>
+          </w:tcPr>
+          <w:p>
+            <w:r>
+              <w:rPr>
+                <w:b w:val="false"/>
+                <w:bCs w:val="false"/>
+                <w:color w:val="000000"/>
+                <w:sz w:val="19"/>
+                <w:szCs w:val="19"/>
+              </w:rPr>
+              <w:t xml:space="preserve">Krum (robust)</w:t>
+            </w:r>
+          </w:p>
+        </w:tc>
+        <w:tc>
+          <w:tcPr>
+            <w:tcW w:type="dxa" w:w="2200"/>
+            <w:tcMar>
+              <w:top w:type="dxa" w:w="40"/>
+              <w:left w:type="dxa" w:w="80"/>
+              <w:bottom w:type="dxa" w:w="40"/>
+              <w:right w:type="dxa" w:w="80"/>
+            </w:tcMar>
+          </w:tcPr>
+          <w:p>
+            <w:r>
+              <w:rPr>
+                <w:b w:val="false"/>
+                <w:bCs w:val="false"/>
+                <w:color w:val="000000"/>
+                <w:sz w:val="19"/>
+                <w:szCs w:val="19"/>
+              </w:rPr>
+              <w:t xml:space="preserve">0.179</w:t>
+            </w:r>
+          </w:p>
+        </w:tc>
+        <w:tc>
+          <w:tcPr>
+            <w:tcW w:type="dxa" w:w="2400"/>
+            <w:tcMar>
+              <w:top w:type="dxa" w:w="40"/>
+              <w:left w:type="dxa" w:w="80"/>
+              <w:bottom w:type="dxa" w:w="40"/>
+              <w:right w:type="dxa" w:w="80"/>
+            </w:tcMar>
+          </w:tcPr>
+          <w:p>
+            <w:r>
+              <w:rPr>
+                <w:b w:val="false"/>
+                <w:bCs w:val="false"/>
+                <w:color w:val="000000"/>
+                <w:sz w:val="19"/>
+                <w:szCs w:val="19"/>
+              </w:rPr>
+              <w:t xml:space="preserve">defended</w:t>
+            </w:r>
+          </w:p>
+        </w:tc>
+      </w:tr>
+      <w:tr>
+        <w:tc>
+          <w:tcPr>
+            <w:tcW w:type="dxa" w:w="3000"/>
+            <w:tcMar>
+              <w:top w:type="dxa" w:w="40"/>
+              <w:left w:type="dxa" w:w="80"/>
+              <w:bottom w:type="dxa" w:w="40"/>
+              <w:right w:type="dxa" w:w="80"/>
+            </w:tcMar>
+          </w:tcPr>
+          <w:p>
+            <w:r>
+              <w:rPr>
+                <w:b w:val="false"/>
+                <w:bCs w:val="false"/>
+                <w:color w:val="000000"/>
+                <w:sz w:val="19"/>
+                <w:szCs w:val="19"/>
+              </w:rPr>
+              <w:t xml:space="preserve">Trimmed-mean (robust)</w:t>
+            </w:r>
+          </w:p>
+        </w:tc>
+        <w:tc>
+          <w:tcPr>
+            <w:tcW w:type="dxa" w:w="2200"/>
+            <w:tcMar>
+              <w:top w:type="dxa" w:w="40"/>
+              <w:left w:type="dxa" w:w="80"/>
+              <w:bottom w:type="dxa" w:w="40"/>
+              <w:right w:type="dxa" w:w="80"/>
+            </w:tcMar>
+          </w:tcPr>
+          <w:p>
+            <w:r>
+              <w:rPr>
+                <w:b w:val="false"/>
+                <w:bCs w:val="false"/>
+                <w:color w:val="000000"/>
+                <w:sz w:val="19"/>
+                <w:szCs w:val="19"/>
+              </w:rPr>
+              <w:t xml:space="preserve">0.172</w:t>
+            </w:r>
+          </w:p>
+        </w:tc>
+        <w:tc>
+          <w:tcPr>
+            <w:tcW w:type="dxa" w:w="2400"/>
+            <w:tcMar>
+              <w:top w:type="dxa" w:w="40"/>
+              <w:left w:type="dxa" w:w="80"/>
+              <w:bottom w:type="dxa" w:w="40"/>
+              <w:right w:type="dxa" w:w="80"/>
+            </w:tcMar>
+          </w:tcPr>
+          <w:p>
+            <w:r>
+              <w:rPr>
+                <w:b w:val="false"/>
+                <w:bCs w:val="false"/>
+                <w:color w:val="000000"/>
+                <w:sz w:val="19"/>
+                <w:szCs w:val="19"/>
+              </w:rPr>
+              <w:t xml:space="preserve">defended</w:t>
+            </w:r>
+          </w:p>
+        </w:tc>
+      </w:tr>
+    </w:tbl>
+    <w:p>
+      <w:pPr>
+        <w:spacing w:after="60"/>
+      </w:pPr>
+    </w:p>
+    <w:p>
+      <w:pPr>
+        <w:spacing w:after="60" w:before="120"/>
+        <w:jc w:val="center"/>
+      </w:pPr>
+      <w:r>
+        <w:drawing>
+          <wp:inline distT="0" distB="0" distL="0" distR="0">
+            <wp:extent cx="4381500" cy="2800350"/>
+            <wp:effectExtent t="0" r="0" b="0" l="0"/>
+            <wp:docPr id="1" name="" descr="" title=""/>
+            <wp:cNvGraphicFramePr>
+              <a:graphicFrameLocks xmlns:a="http://schemas.openxmlformats.org/drawingml/2006/main" noChangeAspect="1"/>
+            </wp:cNvGraphicFramePr>
+            <a:graphic xmlns:a="http://schemas.openxmlformats.org/drawingml/2006/main">
+              <a:graphicData uri="http://schemas.openxmlformats.org/drawingml/2006/picture">
+                <pic:pic xmlns:pic="http://schemas.openxmlformats.org/drawingml/2006/picture">
+                  <pic:nvPicPr>
+                    <pic:cNvPr id="0" name="" descr=""/>
+                    <pic:cNvPicPr>
+                      <a:picLocks noChangeAspect="1" noChangeArrowheads="1"/>
+                    </pic:cNvPicPr>
+                  </pic:nvPicPr>
+                  <pic:blipFill>
+                    <a:blip r:embed="rId16" cstate="none"/>
+                    <a:srcRect/>
+                    <a:stretch>
+                      <a:fillRect/>
+                    </a:stretch>
+                  </pic:blipFill>
+                  <pic:spPr bwMode="auto">
+                    <a:xfrm>
+                      <a:off x="0" y="0"/>
+                      <a:ext cx="4381500" cy="2800350"/>
+                    </a:xfrm>
+                    <a:prstGeom prst="rect">
+                      <a:avLst/>
+                    </a:prstGeom>
+                  </pic:spPr>
+                </pic:pic>
+              </a:graphicData>
+            </a:graphic>
+          </wp:inline>
+        </w:drawing>
+      </w:r>
+    </w:p>
+    <w:p>
+      <w:pPr>
+        <w:spacing w:after="180"/>
+        <w:jc w:val="center"/>
+      </w:pPr>
+      <w:r>
+        <w:rPr>
+          <w:i/>
+          <w:iCs/>
+          <w:color w:val="555555"/>
+          <w:sz w:val="18"/>
+          <w:szCs w:val="18"/>
+        </w:rPr>
+        <w:t xml:space="preserve">Fig. 9 — Under a 2-of-6 poisoning attack, plain FedAvg is pinned at the random floor (red); coordinate-median, trimmed-mean and Krum recover to the clean baseline.</w:t>
+      </w:r>
+    </w:p>
+    <w:p>
+      <w:pPr>
+        <w:spacing w:after="120" w:line="276"/>
+        <w:jc w:val="both"/>
+      </w:pPr>
+      <w:r>
+        <w:rPr>
+          <w:sz w:val="21"/>
+          <w:szCs w:val="21"/>
+        </w:rPr>
+        <w:t xml:space="preserve">Two malicious clients collapse plain FedAvg to the majority floor (0.125 = random on 8 classes), whereas the three </w:t>
+      </w:r>
+      <w:r>
+        <w:rPr>
+          <w:b/>
+          <w:bCs/>
+          <w:sz w:val="21"/>
+          <w:szCs w:val="21"/>
+        </w:rPr>
+        <w:t xml:space="preserve">robust aggregators</w:t>
+      </w:r>
+      <w:r>
+        <w:rPr>
+          <w:sz w:val="21"/>
+          <w:szCs w:val="21"/>
+        </w:rPr>
+        <w:t xml:space="preserve"> — bounding each client's influence via a coordinate-wise median, trimming the extremes, or selecting the update most consistent with the honest majority (Krum) — retain full accuracy. This closes the security analysis with the </w:t>
+      </w:r>
+      <w:r>
+        <w:rPr>
+          <w:b/>
+          <w:bCs/>
+          <w:sz w:val="21"/>
+          <w:szCs w:val="21"/>
+        </w:rPr>
+        <w:t xml:space="preserve">integrity</w:t>
+      </w:r>
+      <w:r>
+        <w:rPr>
+          <w:sz w:val="21"/>
+          <w:szCs w:val="21"/>
+        </w:rPr>
+        <w:t xml:space="preserve"> dimension (attack and defence), alongside the confidentiality results of §3.4–3.6. The aggregators and the attack are covered by the torch-free correctness suite.</w:t>
+      </w:r>
+    </w:p>
+    <w:p>
+      <w:pPr>
+        <w:pStyle w:val="Heading2"/>
+        <w:spacing w:after="80" w:before="180"/>
+      </w:pPr>
+      <w:r>
+        <w:rPr>
+          <w:b/>
+          <w:bCs/>
+        </w:rPr>
+        <w:t xml:space="preserve">3.8  Communication efficiency: top-k sparsification (bonus)</w:t>
+      </w:r>
+    </w:p>
+    <w:p>
+      <w:pPr>
+        <w:spacing w:after="120" w:line="276"/>
+        <w:jc w:val="both"/>
+      </w:pPr>
+      <w:r>
+        <w:rPr>
+          <w:sz w:val="21"/>
+          <w:szCs w:val="21"/>
+        </w:rPr>
+        <w:t xml:space="preserve">FL's practical bottleneck is communication — acute for an edge device like the Pi of §3.6. Top-k sparsification uploads only each client's largest-magnitude update coordinates (value + index) and drops the rest. Warm-starting from a converged model isolates the pure compression effect from the warm-up delay, and sparsification is applied layer-wise so the small classifier head is never starved.</w:t>
+      </w:r>
+    </w:p>
+    <w:tbl>
+      <w:tblPr>
+        <w:tblW w:type="dxa" w:w="8000"/>
+        <w:tblBorders>
+          <w:top w:val="single" w:color="BBBBBB" w:sz="2"/>
+          <w:left w:val="single" w:color="BBBBBB" w:sz="2"/>
+          <w:bottom w:val="single" w:color="BBBBBB" w:sz="2"/>
+          <w:right w:val="single" w:color="BBBBBB" w:sz="2"/>
+          <w:insideH w:val="single" w:color="DDDDDD" w:sz="1"/>
+          <w:insideV w:val="single" w:color="DDDDDD" w:sz="1"/>
+        </w:tblBorders>
+      </w:tblPr>
+      <w:tblGrid>
+        <w:gridCol w:w="2500"/>
+        <w:gridCol w:w="2500"/>
+        <w:gridCol w:w="1500"/>
+        <w:gridCol w:w="1500"/>
+      </w:tblGrid>
+      <w:tr>
+        <w:trPr>
+          <w:tblHeader/>
+        </w:trPr>
+        <w:tc>
+          <w:tcPr>
+            <w:tcW w:type="dxa" w:w="2500"/>
+            <w:shd w:fill="1F6FB2" w:val="clear"/>
+            <w:tcMar>
+              <w:top w:type="dxa" w:w="40"/>
+              <w:left w:type="dxa" w:w="80"/>
+              <w:bottom w:type="dxa" w:w="40"/>
+              <w:right w:type="dxa" w:w="80"/>
+            </w:tcMar>
+          </w:tcPr>
+          <w:p>
+            <w:r>
+              <w:rPr>
+                <w:b/>
+                <w:bCs/>
+                <w:color w:val="FFFFFF"/>
+                <w:sz w:val="19"/>
+                <w:szCs w:val="19"/>
+              </w:rPr>
+              <w:t xml:space="preserve">Update sent</w:t>
+            </w:r>
+          </w:p>
+        </w:tc>
+        <w:tc>
+          <w:tcPr>
+            <w:tcW w:type="dxa" w:w="2500"/>
+            <w:shd w:fill="1F6FB2" w:val="clear"/>
+            <w:tcMar>
+              <w:top w:type="dxa" w:w="40"/>
+              <w:left w:type="dxa" w:w="80"/>
+              <w:bottom w:type="dxa" w:w="40"/>
+              <w:right w:type="dxa" w:w="80"/>
+            </w:tcMar>
+          </w:tcPr>
+          <w:p>
+            <w:r>
+              <w:rPr>
+                <w:b/>
+                <w:bCs/>
+                <w:color w:val="FFFFFF"/>
+                <w:sz w:val="19"/>
+                <w:szCs w:val="19"/>
+              </w:rPr>
+              <w:t xml:space="preserve">Upload / round / client</w:t>
+            </w:r>
+          </w:p>
+        </w:tc>
+        <w:tc>
+          <w:tcPr>
+            <w:tcW w:type="dxa" w:w="1500"/>
+            <w:shd w:fill="1F6FB2" w:val="clear"/>
+            <w:tcMar>
+              <w:top w:type="dxa" w:w="40"/>
+              <w:left w:type="dxa" w:w="80"/>
+              <w:bottom w:type="dxa" w:w="40"/>
+              <w:right w:type="dxa" w:w="80"/>
+            </w:tcMar>
+          </w:tcPr>
+          <w:p>
+            <w:r>
+              <w:rPr>
+                <w:b/>
+                <w:bCs/>
+                <w:color w:val="FFFFFF"/>
+                <w:sz w:val="19"/>
+                <w:szCs w:val="19"/>
+              </w:rPr>
+              <w:t xml:space="preserve">Compression</w:t>
+            </w:r>
+          </w:p>
+        </w:tc>
+        <w:tc>
+          <w:tcPr>
+            <w:tcW w:type="dxa" w:w="1500"/>
+            <w:shd w:fill="1F6FB2" w:val="clear"/>
+            <w:tcMar>
+              <w:top w:type="dxa" w:w="40"/>
+              <w:left w:type="dxa" w:w="80"/>
+              <w:bottom w:type="dxa" w:w="40"/>
+              <w:right w:type="dxa" w:w="80"/>
+            </w:tcMar>
+          </w:tcPr>
+          <w:p>
+            <w:r>
+              <w:rPr>
+                <w:b/>
+                <w:bCs/>
+                <w:color w:val="FFFFFF"/>
+                <w:sz w:val="19"/>
+                <w:szCs w:val="19"/>
+              </w:rPr>
+              <w:t xml:space="preserve">Balanced accuracy</w:t>
+            </w:r>
+          </w:p>
+        </w:tc>
+      </w:tr>
+      <w:tr>
+        <w:tc>
+          <w:tcPr>
+            <w:tcW w:type="dxa" w:w="2500"/>
+            <w:tcMar>
+              <w:top w:type="dxa" w:w="40"/>
+              <w:left w:type="dxa" w:w="80"/>
+              <w:bottom w:type="dxa" w:w="40"/>
+              <w:right w:type="dxa" w:w="80"/>
+            </w:tcMar>
+          </w:tcPr>
+          <w:p>
+            <w:r>
+              <w:rPr>
+                <w:b w:val="false"/>
+                <w:bCs w:val="false"/>
+                <w:color w:val="000000"/>
+                <w:sz w:val="19"/>
+                <w:szCs w:val="19"/>
+              </w:rPr>
+              <w:t xml:space="preserve">Full model (100%)</w:t>
+            </w:r>
+          </w:p>
+        </w:tc>
+        <w:tc>
+          <w:tcPr>
+            <w:tcW w:type="dxa" w:w="2500"/>
+            <w:tcMar>
+              <w:top w:type="dxa" w:w="40"/>
+              <w:left w:type="dxa" w:w="80"/>
+              <w:bottom w:type="dxa" w:w="40"/>
+              <w:right w:type="dxa" w:w="80"/>
+            </w:tcMar>
+          </w:tcPr>
+          <w:p>
+            <w:r>
+              <w:rPr>
+                <w:b w:val="false"/>
+                <w:bCs w:val="false"/>
+                <w:color w:val="000000"/>
+                <w:sz w:val="19"/>
+                <w:szCs w:val="19"/>
+              </w:rPr>
+              <w:t xml:space="preserve">44.7 MB</w:t>
+            </w:r>
+          </w:p>
+        </w:tc>
+        <w:tc>
+          <w:tcPr>
+            <w:tcW w:type="dxa" w:w="1500"/>
+            <w:tcMar>
+              <w:top w:type="dxa" w:w="40"/>
+              <w:left w:type="dxa" w:w="80"/>
+              <w:bottom w:type="dxa" w:w="40"/>
+              <w:right w:type="dxa" w:w="80"/>
+            </w:tcMar>
+          </w:tcPr>
+          <w:p>
+            <w:r>
+              <w:rPr>
+                <w:b w:val="false"/>
+                <w:bCs w:val="false"/>
+                <w:color w:val="000000"/>
+                <w:sz w:val="19"/>
+                <w:szCs w:val="19"/>
+              </w:rPr>
+              <w:t xml:space="preserve">1×</w:t>
+            </w:r>
+          </w:p>
+        </w:tc>
+        <w:tc>
+          <w:tcPr>
+            <w:tcW w:type="dxa" w:w="1500"/>
+            <w:tcMar>
+              <w:top w:type="dxa" w:w="40"/>
+              <w:left w:type="dxa" w:w="80"/>
+              <w:bottom w:type="dxa" w:w="40"/>
+              <w:right w:type="dxa" w:w="80"/>
+            </w:tcMar>
+          </w:tcPr>
+          <w:p>
+            <w:r>
+              <w:rPr>
+                <w:b w:val="false"/>
+                <w:bCs w:val="false"/>
+                <w:color w:val="000000"/>
+                <w:sz w:val="19"/>
+                <w:szCs w:val="19"/>
+              </w:rPr>
+              <w:t xml:space="preserve">0.205</w:t>
+            </w:r>
+          </w:p>
+        </w:tc>
+      </w:tr>
+      <w:tr>
+        <w:tc>
+          <w:tcPr>
+            <w:tcW w:type="dxa" w:w="2500"/>
+            <w:tcMar>
+              <w:top w:type="dxa" w:w="40"/>
+              <w:left w:type="dxa" w:w="80"/>
+              <w:bottom w:type="dxa" w:w="40"/>
+              <w:right w:type="dxa" w:w="80"/>
+            </w:tcMar>
+          </w:tcPr>
+          <w:p>
+            <w:r>
+              <w:rPr>
+                <w:b w:val="false"/>
+                <w:bCs w:val="false"/>
+                <w:color w:val="000000"/>
+                <w:sz w:val="19"/>
+                <w:szCs w:val="19"/>
+              </w:rPr>
+              <w:t xml:space="preserve">Top 10% of values</w:t>
+            </w:r>
+          </w:p>
+        </w:tc>
+        <w:tc>
+          <w:tcPr>
+            <w:tcW w:type="dxa" w:w="2500"/>
+            <w:tcMar>
+              <w:top w:type="dxa" w:w="40"/>
+              <w:left w:type="dxa" w:w="80"/>
+              <w:bottom w:type="dxa" w:w="40"/>
+              <w:right w:type="dxa" w:w="80"/>
+            </w:tcMar>
+          </w:tcPr>
+          <w:p>
+            <w:r>
+              <w:rPr>
+                <w:b w:val="false"/>
+                <w:bCs w:val="false"/>
+                <w:color w:val="000000"/>
+                <w:sz w:val="19"/>
+                <w:szCs w:val="19"/>
+              </w:rPr>
+              <w:t xml:space="preserve">8.9 MB</w:t>
+            </w:r>
+          </w:p>
+        </w:tc>
+        <w:tc>
+          <w:tcPr>
+            <w:tcW w:type="dxa" w:w="1500"/>
+            <w:tcMar>
+              <w:top w:type="dxa" w:w="40"/>
+              <w:left w:type="dxa" w:w="80"/>
+              <w:bottom w:type="dxa" w:w="40"/>
+              <w:right w:type="dxa" w:w="80"/>
+            </w:tcMar>
+          </w:tcPr>
+          <w:p>
+            <w:r>
+              <w:rPr>
+                <w:b w:val="false"/>
+                <w:bCs w:val="false"/>
+                <w:color w:val="000000"/>
+                <w:sz w:val="19"/>
+                <w:szCs w:val="19"/>
+              </w:rPr>
+              <w:t xml:space="preserve">5×</w:t>
+            </w:r>
+          </w:p>
+        </w:tc>
+        <w:tc>
+          <w:tcPr>
+            <w:tcW w:type="dxa" w:w="1500"/>
+            <w:tcMar>
+              <w:top w:type="dxa" w:w="40"/>
+              <w:left w:type="dxa" w:w="80"/>
+              <w:bottom w:type="dxa" w:w="40"/>
+              <w:right w:type="dxa" w:w="80"/>
+            </w:tcMar>
+          </w:tcPr>
+          <w:p>
+            <w:r>
+              <w:rPr>
+                <w:b w:val="false"/>
+                <w:bCs w:val="false"/>
+                <w:color w:val="000000"/>
+                <w:sz w:val="19"/>
+                <w:szCs w:val="19"/>
+              </w:rPr>
+              <w:t xml:space="preserve">0.197</w:t>
+            </w:r>
+          </w:p>
+        </w:tc>
+      </w:tr>
+      <w:tr>
+        <w:tc>
+          <w:tcPr>
+            <w:tcW w:type="dxa" w:w="2500"/>
+            <w:tcMar>
+              <w:top w:type="dxa" w:w="40"/>
+              <w:left w:type="dxa" w:w="80"/>
+              <w:bottom w:type="dxa" w:w="40"/>
+              <w:right w:type="dxa" w:w="80"/>
+            </w:tcMar>
+          </w:tcPr>
+          <w:p>
+            <w:r>
+              <w:rPr>
+                <w:b w:val="false"/>
+                <w:bCs w:val="false"/>
+                <w:color w:val="000000"/>
+                <w:sz w:val="19"/>
+                <w:szCs w:val="19"/>
+              </w:rPr>
+              <w:t xml:space="preserve">Top 1% of values</w:t>
+            </w:r>
+          </w:p>
+        </w:tc>
+        <w:tc>
+          <w:tcPr>
+            <w:tcW w:type="dxa" w:w="2500"/>
+            <w:tcMar>
+              <w:top w:type="dxa" w:w="40"/>
+              <w:left w:type="dxa" w:w="80"/>
+              <w:bottom w:type="dxa" w:w="40"/>
+              <w:right w:type="dxa" w:w="80"/>
+            </w:tcMar>
+          </w:tcPr>
+          <w:p>
+            <w:r>
+              <w:rPr>
+                <w:b w:val="false"/>
+                <w:bCs w:val="false"/>
+                <w:color w:val="000000"/>
+                <w:sz w:val="19"/>
+                <w:szCs w:val="19"/>
+              </w:rPr>
+              <w:t xml:space="preserve">0.89 MB</w:t>
+            </w:r>
+          </w:p>
+        </w:tc>
+        <w:tc>
+          <w:tcPr>
+            <w:tcW w:type="dxa" w:w="1500"/>
+            <w:tcMar>
+              <w:top w:type="dxa" w:w="40"/>
+              <w:left w:type="dxa" w:w="80"/>
+              <w:bottom w:type="dxa" w:w="40"/>
+              <w:right w:type="dxa" w:w="80"/>
+            </w:tcMar>
+          </w:tcPr>
+          <w:p>
+            <w:r>
+              <w:rPr>
+                <w:b w:val="false"/>
+                <w:bCs w:val="false"/>
+                <w:color w:val="000000"/>
+                <w:sz w:val="19"/>
+                <w:szCs w:val="19"/>
+              </w:rPr>
+              <w:t xml:space="preserve">50×</w:t>
+            </w:r>
+          </w:p>
+        </w:tc>
+        <w:tc>
+          <w:tcPr>
+            <w:tcW w:type="dxa" w:w="1500"/>
+            <w:tcMar>
+              <w:top w:type="dxa" w:w="40"/>
+              <w:left w:type="dxa" w:w="80"/>
+              <w:bottom w:type="dxa" w:w="40"/>
+              <w:right w:type="dxa" w:w="80"/>
+            </w:tcMar>
+          </w:tcPr>
+          <w:p>
+            <w:r>
+              <w:rPr>
+                <w:b w:val="false"/>
+                <w:bCs w:val="false"/>
+                <w:color w:val="000000"/>
+                <w:sz w:val="19"/>
+                <w:szCs w:val="19"/>
+              </w:rPr>
+              <w:t xml:space="preserve">0.202</w:t>
+            </w:r>
+          </w:p>
+        </w:tc>
+      </w:tr>
+    </w:tbl>
+    <w:p>
+      <w:pPr>
+        <w:spacing w:after="60"/>
+      </w:pPr>
+    </w:p>
+    <w:p>
+      <w:pPr>
+        <w:spacing w:after="60" w:before="120"/>
+        <w:jc w:val="center"/>
+      </w:pPr>
+      <w:r>
+        <w:drawing>
+          <wp:inline distT="0" distB="0" distL="0" distR="0">
+            <wp:extent cx="4762500" cy="1857375"/>
+            <wp:effectExtent t="0" r="0" b="0" l="0"/>
+            <wp:docPr id="1" name="" descr="" title=""/>
+            <wp:cNvGraphicFramePr>
+              <a:graphicFrameLocks xmlns:a="http://schemas.openxmlformats.org/drawingml/2006/main" noChangeAspect="1"/>
+            </wp:cNvGraphicFramePr>
+            <a:graphic xmlns:a="http://schemas.openxmlformats.org/drawingml/2006/main">
+              <a:graphicData uri="http://schemas.openxmlformats.org/drawingml/2006/picture">
+                <pic:pic xmlns:pic="http://schemas.openxmlformats.org/drawingml/2006/picture">
+                  <pic:nvPicPr>
+                    <pic:cNvPr id="0" name="" descr=""/>
+                    <pic:cNvPicPr>
+                      <a:picLocks noChangeAspect="1" noChangeArrowheads="1"/>
+                    </pic:cNvPicPr>
+                  </pic:nvPicPr>
+                  <pic:blipFill>
+                    <a:blip r:embed="rId17" cstate="none"/>
+                    <a:srcRect/>
+                    <a:stretch>
+                      <a:fillRect/>
+                    </a:stretch>
+                  </pic:blipFill>
+                  <pic:spPr bwMode="auto">
+                    <a:xfrm>
+                      <a:off x="0" y="0"/>
+                      <a:ext cx="4762500" cy="1857375"/>
+                    </a:xfrm>
+                    <a:prstGeom prst="rect">
+                      <a:avLst/>
+                    </a:prstGeom>
+                  </pic:spPr>
+                </pic:pic>
+              </a:graphicData>
+            </a:graphic>
+          </wp:inline>
+        </w:drawing>
+      </w:r>
+    </w:p>
+    <w:p>
+      <w:pPr>
+        <w:spacing w:after="180"/>
+        <w:jc w:val="center"/>
+      </w:pPr>
+      <w:r>
+        <w:rPr>
+          <w:i/>
+          <w:iCs/>
+          <w:color w:val="555555"/>
+          <w:sz w:val="18"/>
+          <w:szCs w:val="18"/>
+        </w:rPr>
+        <w:t xml:space="preserve">Fig. 10 — Balanced accuracy stays ≈ 0.20 across the whole range: uploads can shrink 50× for essentially no accuracy cost.</w:t>
+      </w:r>
+    </w:p>
+    <w:p>
+      <w:pPr>
+        <w:spacing w:after="120" w:line="276"/>
+        <w:jc w:val="both"/>
+      </w:pPr>
+      <w:r>
+        <w:rPr>
+          <w:sz w:val="21"/>
+          <w:szCs w:val="21"/>
+        </w:rPr>
+        <w:t xml:space="preserve">Sending only the top </w:t>
+      </w:r>
+      <w:r>
+        <w:rPr>
+          <w:b/>
+          <w:bCs/>
+          <w:sz w:val="21"/>
+          <w:szCs w:val="21"/>
+        </w:rPr>
+        <w:t xml:space="preserve">1%</w:t>
+      </w:r>
+      <w:r>
+        <w:rPr>
+          <w:sz w:val="21"/>
+          <w:szCs w:val="21"/>
+        </w:rPr>
+        <w:t xml:space="preserve"> of coordinates shrinks each upload </w:t>
+      </w:r>
+      <w:r>
+        <w:rPr>
+          <w:b/>
+          <w:bCs/>
+          <w:sz w:val="21"/>
+          <w:szCs w:val="21"/>
+        </w:rPr>
+        <w:t xml:space="preserve">50×</w:t>
+      </w:r>
+      <w:r>
+        <w:rPr>
+          <w:sz w:val="21"/>
+          <w:szCs w:val="21"/>
+        </w:rPr>
+        <w:t xml:space="preserve"> (44.7 MB → 0.89 MB) while balanced accuracy is essentially unchanged (0.202 vs 0.205). This makes federation practical for bandwidth-limited participants and pairs directly with the straggler finding: the slowest, weakest device is also the one that gains most from sending far less.</w:t>
+      </w:r>
+    </w:p>
+    <w:p>
+      <w:pPr>
         <w:pStyle w:val="Heading1"/>
         <w:spacing w:after="120" w:before="260"/>
       </w:pPr>
@@ -4028,6 +5188,40 @@
     </w:p>
     <w:p>
       <w:pPr>
+        <w:pStyle w:val="ListParagraph"/>
+        <w:numPr>
+          <w:ilvl w:val="0"/>
+          <w:numId w:val="2"/>
+        </w:numPr>
+        <w:spacing w:after="60"/>
+      </w:pPr>
+      <w:r>
+        <w:rPr>
+          <w:sz w:val="21"/>
+          <w:szCs w:val="21"/>
+        </w:rPr>
+        <w:t xml:space="preserve">Explainability (Grad-CAM) on the compute-limited model showed diffuse attention that sometimes falls on image borders/artefacts rather than the lesion — a documented dermoscopy shortcut, reported honestly as a signal that a production model would need stronger, verified attention before clinical use.</w:t>
+      </w:r>
+    </w:p>
+    <w:p>
+      <w:pPr>
+        <w:pStyle w:val="ListParagraph"/>
+        <w:numPr>
+          <w:ilvl w:val="0"/>
+          <w:numId w:val="2"/>
+        </w:numPr>
+        <w:spacing w:after="60"/>
+      </w:pPr>
+      <w:r>
+        <w:rPr>
+          <w:sz w:val="21"/>
+          <w:szCs w:val="21"/>
+        </w:rPr>
+        <w:t xml:space="preserve">The robustness and communication-efficiency studies were run at dev tier (single seed) to establish the mechanism; the effects are large and clear, but full-tier multi-seed confirmation is future work.</w:t>
+      </w:r>
+    </w:p>
+    <w:p>
+      <w:pPr>
         <w:pStyle w:val="Heading2"/>
         <w:spacing w:after="80" w:before="180"/>
       </w:pPr>
@@ -4076,7 +5270,7 @@
           <w:sz w:val="21"/>
           <w:szCs w:val="21"/>
         </w:rPr>
-        <w:t xml:space="preserve">We built and validated a complete cross-silo FL system for skin-lesion classification and answered all eight research sub-questions with reproducible evidence. Federation substantially outperforms isolated local training and recovers much of the gap to centralized accuracy without sharing raw images; FedProx and SCAFFOLD reduce client drift as theory predicts but, on this benchmark, do not improve balanced accuracy over plain FedAvg — a concrete, honestly-reported finding; differential privacy imposes a measured, monotonic accuracy cost while demonstrably reducing membership-inference leakage; and secure aggregation provably hides individual updates while recovering the exact aggregate. The pipeline is fully reproducible from configuration, with every reported number traceable to a generated artefact. Beyond the simulation, the system was demonstrated running genuinely distributed across a laptop and a Raspberry Pi 5 edge hospital (Flower/gRPC) — raw data never leaving the device — with the cross-device straggler effect (the Pi ≈ 17× slower per round) measured directly.</w:t>
+        <w:t xml:space="preserve">We built and validated a complete cross-silo FL system for skin-lesion classification and answered all eight research sub-questions with reproducible evidence. Federation substantially outperforms isolated local training and recovers much of the gap to centralized accuracy without sharing raw images; FedProx and SCAFFOLD reduce client drift as theory predicts but, on this benchmark, do not improve balanced accuracy over plain FedAvg — a concrete, honestly-reported finding; differential privacy imposes a measured, monotonic accuracy cost while demonstrably reducing membership-inference leakage; and secure aggregation provably hides individual updates while recovering the exact aggregate. The pipeline is fully reproducible from configuration, with every reported number traceable to a generated artefact. Beyond the simulation, the system was demonstrated running genuinely distributed across a laptop and a Raspberry Pi 5 edge hospital (Flower/gRPC) — raw data never leaving the device — with the cross-device straggler effect (the Pi ≈ 17× slower per round) measured directly. Bonus studies add the integrity half of security — robust aggregation (median / trimmed-mean / Krum) defeats a 2-of-6 poisoning attack that collapses plain FedAvg to random — and a 50× communication saving at no accuracy cost.</w:t>
       </w:r>
     </w:p>
     <w:p>
@@ -4280,6 +5474,90 @@
           <w:szCs w:val="19"/>
         </w:rPr>
         <w:t xml:space="preserve">A. Yousefpour et al., “Opacus: User-Friendly Differential Privacy Library in PyTorch,” arXiv:2109.12298, 2021.</w:t>
+      </w:r>
+    </w:p>
+    <w:p>
+      <w:pPr>
+        <w:spacing w:after="80"/>
+      </w:pPr>
+      <w:r>
+        <w:rPr>
+          <w:b/>
+          <w:bCs/>
+          <w:sz w:val="19"/>
+          <w:szCs w:val="19"/>
+        </w:rPr>
+        <w:t xml:space="preserve">[10] </w:t>
+      </w:r>
+      <w:r>
+        <w:rPr>
+          <w:sz w:val="19"/>
+          <w:szCs w:val="19"/>
+        </w:rPr>
+        <w:t xml:space="preserve">P. Blanchard, E. M. El Mhamdi, R. Guerraoui, J. Stainer, “Machine Learning with Adversaries: Byzantine Tolerant Gradient Descent (Krum),” in Proc. NeurIPS, 2017.</w:t>
+      </w:r>
+    </w:p>
+    <w:p>
+      <w:pPr>
+        <w:spacing w:after="80"/>
+      </w:pPr>
+      <w:r>
+        <w:rPr>
+          <w:b/>
+          <w:bCs/>
+          <w:sz w:val="19"/>
+          <w:szCs w:val="19"/>
+        </w:rPr>
+        <w:t xml:space="preserve">[11] </w:t>
+      </w:r>
+      <w:r>
+        <w:rPr>
+          <w:sz w:val="19"/>
+          <w:szCs w:val="19"/>
+        </w:rPr>
+        <w:t xml:space="preserve">D. Yin, Y. Chen, K. Ramchandran, P. Bartlett, “Byzantine-Robust Distributed Learning: Towards Optimal Statistical Rates (median / trimmed-mean),” in Proc. ICML, 2018.</w:t>
+      </w:r>
+    </w:p>
+    <w:p>
+      <w:pPr>
+        <w:spacing w:after="80"/>
+      </w:pPr>
+      <w:r>
+        <w:rPr>
+          <w:b/>
+          <w:bCs/>
+          <w:sz w:val="19"/>
+          <w:szCs w:val="19"/>
+        </w:rPr>
+        <w:t xml:space="preserve">[12] </w:t>
+      </w:r>
+      <w:r>
+        <w:rPr>
+          <w:sz w:val="19"/>
+          <w:szCs w:val="19"/>
+        </w:rPr>
+        <w:t xml:space="preserve">S. J. Reddi et al., “Adaptive Federated Optimization (FedAdam),” in Proc. ICLR, 2021.</w:t>
+      </w:r>
+    </w:p>
+    <w:p>
+      <w:pPr>
+        <w:spacing w:after="80"/>
+      </w:pPr>
+      <w:r>
+        <w:rPr>
+          <w:b/>
+          <w:bCs/>
+          <w:sz w:val="19"/>
+          <w:szCs w:val="19"/>
+        </w:rPr>
+        <w:t xml:space="preserve">[13] </w:t>
+      </w:r>
+      <w:r>
+        <w:rPr>
+          <w:sz w:val="19"/>
+          <w:szCs w:val="19"/>
+        </w:rPr>
+        <w:t xml:space="preserve">R. R. Selvaraju et al., “Grad-CAM: Visual Explanations from Deep Networks via Gradient-based Localization,” in Proc. IEEE ICCV, 2017, pp. 618–626.</w:t>
       </w:r>
     </w:p>
     <w:sectPr>

</xml_diff>

<commit_message>
Regenerate technical report (11 pages): straggler mitigation paragraph — freeze-backbone 8.99x verified on Pi
</commit_message>
<xml_diff>
--- a/reports/technical_report.docx
+++ b/reports/technical_report.docx
@@ -3714,6 +3714,51 @@
           <w:szCs w:val="21"/>
         </w:rPr>
         <w:t xml:space="preserve">.</w:t>
+      </w:r>
+    </w:p>
+    <w:p>
+      <w:pPr>
+        <w:spacing w:after="120" w:line="276"/>
+        <w:jc w:val="both"/>
+      </w:pPr>
+      <w:r>
+        <w:rPr>
+          <w:sz w:val="21"/>
+          <w:szCs w:val="21"/>
+        </w:rPr>
+        <w:t xml:space="preserve">We then mitigated the straggler directly with </w:t>
+      </w:r>
+      <w:r>
+        <w:rPr>
+          <w:b/>
+          <w:bCs/>
+          <w:sz w:val="21"/>
+          <w:szCs w:val="21"/>
+        </w:rPr>
+        <w:t xml:space="preserve">partial-model federated learning</w:t>
+      </w:r>
+      <w:r>
+        <w:rPr>
+          <w:sz w:val="21"/>
+          <w:szCs w:val="21"/>
+        </w:rPr>
+        <w:t xml:space="preserve"> (freeze-backbone): the Pi trains only the 4,104-parameter classifier head (0.04% of the 11.18 M-parameter model), eliminating the backward pass through the backbone while leaving the architecture — and therefore FedAvg aggregation — unchanged; the client simply abstains on the backbone and votes on the head. A self-validating on-device benchmark first proves correctness (frozen backbone bit-identical after training; the head learns; state-dict keys unchanged), then measures the effect: the Pi's round time falls from </w:t>
+      </w:r>
+      <w:r>
+        <w:rPr>
+          <w:b/>
+          <w:bCs/>
+          <w:sz w:val="21"/>
+          <w:szCs w:val="21"/>
+        </w:rPr>
+        <w:t xml:space="preserve">8.28 s to 0.92 s — an 8.99× speedup</w:t>
+      </w:r>
+      <w:r>
+        <w:rPr>
+          <w:sz w:val="21"/>
+          <w:szCs w:val="21"/>
+        </w:rPr>
+        <w:t xml:space="preserve"> — shrinking the measured straggler gap from ≈17× to under 2×. The straggler problem is thus measured, mitigated, and verified on the same hardware.</w:t>
       </w:r>
     </w:p>
     <w:p>

</xml_diff>